<commit_message>
docs(cv): update bilingual CVs with training experience and KOD8
</commit_message>
<xml_diff>
--- a/docs/cv/source/CV_Rodrigue_Koudakpo_Developpeur.docx
+++ b/docs/cv/source/CV_Rodrigue_Koudakpo_Developpeur.docx
@@ -41,7 +41,7 @@
           <w:sz w:val="21"/>
           <w:szCs w:val="21"/>
         </w:rPr>
-        <w:t xml:space="preserve">DÉVELOPPEUR D'APPLICATIONS MOBILES &amp; WEB  ·  FLUTTER  ·  NEXT.JS</w:t>
+        <w:t>DÉVELOPPEUR FLUTTER &amp; FULL STACK · FORMATEUR</w:t>
       </w:r>
     </w:p>
     <w:p>
@@ -146,13 +146,7 @@
         <w:jc w:val="both"/>
       </w:pPr>
       <w:r>
-        <w:rPr>
-          <w:rFonts w:ascii="Calibri" w:cs="Calibri" w:eastAsia="Calibri" w:hAnsi="Calibri"/>
-          <w:color w:val="1A1A1A"/>
-          <w:sz w:val="18"/>
-          <w:szCs w:val="18"/>
-        </w:rPr>
-        <w:t xml:space="preserve">Développeur autodidacte : je programme depuis 2019 et je me suis spécialisé en Flutter depuis 2022. Je conçois et livre des applications mobiles et web de l'idée au déploiement, pour des contraintes réelles : connectivité variable, paiements mobiles, utilisateurs non techniques. Deux missions freelance livrées en production (App Store et Play Store), plusieurs produits personnels publiés, associé chez Darollo Technologies Corporation, et développeur indépendant sous la marque Koudatek. Étudiant en Gestion de Projet Digital (ESCEN).</w:t>
+        <w:t>Développeur autodidacte depuis 2019, spécialisé Flutter depuis 2022. Je conçois et livre des applications mobiles et web de l’idée au déploiement : connectivité variable, paiements mobiles, utilisateurs non techniques. Associé chez DTC et développeur indépendant, je suis également formateur Python à domicile et en ligne, notamment pour des besoins professionnels de gestion de données.</w:t>
       </w:r>
     </w:p>
     <w:p>
@@ -327,6 +321,36 @@
       </w:r>
     </w:p>
     <w:p>
+      <w:pPr/>
+      <w:r>
+        <w:t>Formateur indépendant</w:t>
+        <w:tab/>
+        <w:t>Depuis 2025</w:t>
+      </w:r>
+    </w:p>
+    <w:p>
+      <w:pPr/>
+      <w:r>
+        <w:t>Cours particuliers à domicile et en ligne</w:t>
+      </w:r>
+    </w:p>
+    <w:p>
+      <w:pPr>
+        <w:pStyle w:val="ListParagraph"/>
+      </w:pPr>
+      <w:r>
+        <w:t>Formation Python adaptée aux objectifs des apprenants, notamment professionnels : programmation et gestion de données.</w:t>
+      </w:r>
+    </w:p>
+    <w:p>
+      <w:pPr>
+        <w:pStyle w:val="ListParagraph"/>
+      </w:pPr>
+      <w:r>
+        <w:t>Conception de supports et d’exercices pratiques ; préparation d’une formation de groupe en club universitaire.</w:t>
+      </w:r>
+    </w:p>
+    <w:p>
       <w:pPr>
         <w:keepNext/>
         <w:tabs>
@@ -818,6 +842,14 @@
           <w:szCs w:val="23"/>
         </w:rPr>
         <w:t xml:space="preserve">PROJETS SÉLECTIONNÉS</w:t>
+      </w:r>
+    </w:p>
+    <w:p>
+      <w:pPr>
+        <w:pStyle w:val="ListParagraph"/>
+      </w:pPr>
+      <w:r>
+        <w:t>KOD8 — plateforme de formation conçue et développée de bout en bout : parcours Python de 14 modules, initiation à l’IA et correction automatique des exercices. kod8.rodriguekoudakpo.com</w:t>
       </w:r>
     </w:p>
     <w:p>

</xml_diff>